<commit_message>
Articles pushed as of 28th Feb
</commit_message>
<xml_diff>
--- a/Articles/Baraha Tamil Latha Letters Editing.docx
+++ b/Articles/Baraha Tamil Latha Letters Editing.docx
@@ -1,6 +1,6 @@
 
 <file path=word/document.xml><?xml version="1.0" encoding="utf-8"?>
-<w:document xmlns:wpc="http://schemas.microsoft.com/office/word/2010/wordprocessingCanvas" xmlns:cx="http://schemas.microsoft.com/office/drawing/2014/chartex" xmlns:cx1="http://schemas.microsoft.com/office/drawing/2015/9/8/chartex" xmlns:cx2="http://schemas.microsoft.com/office/drawing/2015/10/21/chartex" xmlns:cx3="http://schemas.microsoft.com/office/drawing/2016/5/9/chartex" xmlns:cx4="http://schemas.microsoft.com/office/drawing/2016/5/10/chartex" xmlns:cx5="http://schemas.microsoft.com/office/drawing/2016/5/11/chartex" xmlns:cx6="http://schemas.microsoft.com/office/drawing/2016/5/12/chartex" xmlns:cx7="http://schemas.microsoft.com/office/drawing/2016/5/13/chartex" xmlns:cx8="http://schemas.microsoft.com/office/drawing/2016/5/14/chartex" xmlns:mc="http://schemas.openxmlformats.org/markup-compatibility/2006" xmlns:aink="http://schemas.microsoft.com/office/drawing/2016/ink" xmlns:am3d="http://schemas.microsoft.com/office/drawing/2017/model3d" xmlns:o="urn:schemas-microsoft-com:office:office" xmlns:r="http://schemas.openxmlformats.org/officeDocument/2006/relationships" xmlns:m="http://schemas.openxmlformats.org/officeDocument/2006/math" xmlns:v="urn:schemas-microsoft-com:vml" xmlns:wp14="http://schemas.microsoft.com/office/word/2010/wordprocessingDrawing" xmlns:wp="http://schemas.openxmlformats.org/drawingml/2006/wordprocessingDrawing" xmlns:w10="urn:schemas-microsoft-com:office:word" xmlns:w="http://schemas.openxmlformats.org/wordprocessingml/2006/main" xmlns:w14="http://schemas.microsoft.com/office/word/2010/wordml" xmlns:w15="http://schemas.microsoft.com/office/word/2012/wordml" xmlns:w16cex="http://schemas.microsoft.com/office/word/2018/wordml/cex" xmlns:w16cid="http://schemas.microsoft.com/office/word/2016/wordml/cid" xmlns:w16="http://schemas.microsoft.com/office/word/2018/wordml" xmlns:w16se="http://schemas.microsoft.com/office/word/2015/wordml/symex" xmlns:wpg="http://schemas.microsoft.com/office/word/2010/wordprocessingGroup" xmlns:wpi="http://schemas.microsoft.com/office/word/2010/wordprocessingInk" xmlns:wne="http://schemas.microsoft.com/office/word/2006/wordml" xmlns:wps="http://schemas.microsoft.com/office/word/2010/wordprocessingShape" mc:Ignorable="w14 w15 w16se w16cid w16 w16cex wp14">
+<w:document xmlns:wpc="http://schemas.microsoft.com/office/word/2010/wordprocessingCanvas" xmlns:cx="http://schemas.microsoft.com/office/drawing/2014/chartex" xmlns:cx1="http://schemas.microsoft.com/office/drawing/2015/9/8/chartex" xmlns:cx2="http://schemas.microsoft.com/office/drawing/2015/10/21/chartex" xmlns:cx3="http://schemas.microsoft.com/office/drawing/2016/5/9/chartex" xmlns:cx4="http://schemas.microsoft.com/office/drawing/2016/5/10/chartex" xmlns:cx5="http://schemas.microsoft.com/office/drawing/2016/5/11/chartex" xmlns:cx6="http://schemas.microsoft.com/office/drawing/2016/5/12/chartex" xmlns:cx7="http://schemas.microsoft.com/office/drawing/2016/5/13/chartex" xmlns:cx8="http://schemas.microsoft.com/office/drawing/2016/5/14/chartex" xmlns:mc="http://schemas.openxmlformats.org/markup-compatibility/2006" xmlns:aink="http://schemas.microsoft.com/office/drawing/2016/ink" xmlns:am3d="http://schemas.microsoft.com/office/drawing/2017/model3d" xmlns:o="urn:schemas-microsoft-com:office:office" xmlns:oel="http://schemas.microsoft.com/office/2019/extlst" xmlns:r="http://schemas.openxmlformats.org/officeDocument/2006/relationships" xmlns:m="http://schemas.openxmlformats.org/officeDocument/2006/math" xmlns:v="urn:schemas-microsoft-com:vml" xmlns:wp14="http://schemas.microsoft.com/office/word/2010/wordprocessingDrawing" xmlns:wp="http://schemas.openxmlformats.org/drawingml/2006/wordprocessingDrawing" xmlns:w10="urn:schemas-microsoft-com:office:word" xmlns:w="http://schemas.openxmlformats.org/wordprocessingml/2006/main" xmlns:w14="http://schemas.microsoft.com/office/word/2010/wordml" xmlns:w15="http://schemas.microsoft.com/office/word/2012/wordml" xmlns:w16cex="http://schemas.microsoft.com/office/word/2018/wordml/cex" xmlns:w16cid="http://schemas.microsoft.com/office/word/2016/wordml/cid" xmlns:w16="http://schemas.microsoft.com/office/word/2018/wordml" xmlns:w16du="http://schemas.microsoft.com/office/word/2023/wordml/word16du" xmlns:w16sdtdh="http://schemas.microsoft.com/office/word/2020/wordml/sdtdatahash" xmlns:w16sdtfl="http://schemas.microsoft.com/office/word/2024/wordml/sdtformatlock" xmlns:w16se="http://schemas.microsoft.com/office/word/2015/wordml/symex" xmlns:wpg="http://schemas.microsoft.com/office/word/2010/wordprocessingGroup" xmlns:wpi="http://schemas.microsoft.com/office/word/2010/wordprocessingInk" xmlns:wne="http://schemas.microsoft.com/office/word/2006/wordml" xmlns:wps="http://schemas.microsoft.com/office/word/2010/wordprocessingShape" mc:Ignorable="w14 w15 w16se w16cid w16 w16cex w16sdtdh w16sdtfl w16du wp14">
   <w:body>
     <w:p>
       <w:pPr>
@@ -772,7 +772,215 @@
           <w:sz w:val="28"/>
           <w:szCs w:val="28"/>
         </w:rPr>
-        <w:t>The following symbols are for find and replace in final tamil file.</w:t>
+        <w:t xml:space="preserve">The following symbols are for find and replace in final </w:t>
+      </w:r>
+      <w:proofErr w:type="spellStart"/>
+      <w:r>
+        <w:rPr>
+          <w:rFonts w:ascii="Latha" w:hAnsi="Latha" w:cs="Latha"/>
+          <w:color w:val="000000"/>
+          <w:sz w:val="28"/>
+          <w:szCs w:val="28"/>
+        </w:rPr>
+        <w:t>tamil</w:t>
+      </w:r>
+      <w:proofErr w:type="spellEnd"/>
+      <w:r>
+        <w:rPr>
+          <w:rFonts w:ascii="Latha" w:hAnsi="Latha" w:cs="Latha"/>
+          <w:color w:val="000000"/>
+          <w:sz w:val="28"/>
+          <w:szCs w:val="28"/>
+        </w:rPr>
+        <w:t xml:space="preserve"> file.</w:t>
+      </w:r>
+    </w:p>
+    <w:p>
+      <w:pPr>
+        <w:widowControl w:val="0"/>
+        <w:autoSpaceDE w:val="0"/>
+        <w:autoSpaceDN w:val="0"/>
+        <w:adjustRightInd w:val="0"/>
+        <w:spacing w:after="0" w:line="240" w:lineRule="auto"/>
+        <w:rPr>
+          <w:rFonts w:ascii="BRH Tamil Tab Extra" w:hAnsi="BRH Tamil Tab Extra" w:cs="BRH Devanagari Extra"/>
+          <w:b/>
+          <w:bCs/>
+          <w:sz w:val="40"/>
+          <w:szCs w:val="40"/>
+        </w:rPr>
+      </w:pPr>
+      <w:proofErr w:type="spellStart"/>
+      <w:proofErr w:type="gramStart"/>
+      <w:r>
+        <w:rPr>
+          <w:rFonts w:ascii="BRH Devanagari Extra" w:hAnsi="BRH Devanagari Extra" w:cs="BRH Devanagari Extra"/>
+          <w:b/>
+          <w:bCs/>
+          <w:color w:val="000000"/>
+          <w:sz w:val="40"/>
+          <w:szCs w:val="40"/>
+        </w:rPr>
+        <w:t>ñè</w:t>
+      </w:r>
+      <w:proofErr w:type="spellEnd"/>
+      <w:r>
+        <w:rPr>
+          <w:rFonts w:ascii="BRH Devanagari Extra" w:hAnsi="BRH Devanagari Extra" w:cs="BRH Devanagari Extra"/>
+          <w:b/>
+          <w:bCs/>
+          <w:color w:val="000000"/>
+          <w:sz w:val="40"/>
+          <w:szCs w:val="40"/>
+        </w:rPr>
+        <w:t xml:space="preserve">  ñ</w:t>
+      </w:r>
+      <w:proofErr w:type="gramEnd"/>
+      <w:r>
+        <w:rPr>
+          <w:rFonts w:ascii="BRH Devanagari Extra" w:hAnsi="BRH Devanagari Extra" w:cs="BRH Devanagari Extra"/>
+          <w:b/>
+          <w:bCs/>
+          <w:color w:val="000000"/>
+          <w:sz w:val="40"/>
+          <w:szCs w:val="40"/>
+        </w:rPr>
+        <w:t xml:space="preserve"> ò </w:t>
+      </w:r>
+      <w:proofErr w:type="spellStart"/>
+      <w:r>
+        <w:rPr>
+          <w:rFonts w:ascii="BRH Devanagari Extra" w:hAnsi="BRH Devanagari Extra" w:cs="BRH Devanagari Extra"/>
+          <w:b/>
+          <w:bCs/>
+          <w:color w:val="000000"/>
+          <w:sz w:val="40"/>
+          <w:szCs w:val="40"/>
+        </w:rPr>
+        <w:t>óè</w:t>
+      </w:r>
+      <w:proofErr w:type="spellEnd"/>
+      <w:r>
+        <w:rPr>
+          <w:rFonts w:ascii="BRH Devanagari Extra" w:hAnsi="BRH Devanagari Extra" w:cs="BRH Devanagari Extra"/>
+          <w:b/>
+          <w:bCs/>
+          <w:color w:val="000000"/>
+          <w:sz w:val="40"/>
+          <w:szCs w:val="40"/>
+        </w:rPr>
+        <w:t xml:space="preserve"> ó </w:t>
+      </w:r>
+      <w:proofErr w:type="gramStart"/>
+      <w:r>
+        <w:rPr>
+          <w:rFonts w:ascii="BRH Devanagari Extra" w:hAnsi="BRH Devanagari Extra" w:cs="BRH Devanagari Extra"/>
+          <w:b/>
+          <w:bCs/>
+          <w:color w:val="000000"/>
+          <w:sz w:val="40"/>
+          <w:szCs w:val="40"/>
+        </w:rPr>
+        <w:t>Å  ÅÅ</w:t>
+      </w:r>
+      <w:proofErr w:type="gramEnd"/>
+      <w:r>
+        <w:rPr>
+          <w:rFonts w:ascii="BRH Devanagari Extra" w:hAnsi="BRH Devanagari Extra" w:cs="BRH Devanagari Extra"/>
+          <w:b/>
+          <w:bCs/>
+          <w:color w:val="000000"/>
+          <w:sz w:val="40"/>
+          <w:szCs w:val="40"/>
+        </w:rPr>
+        <w:t xml:space="preserve">  Æ</w:t>
+      </w:r>
+      <w:r>
+        <w:rPr>
+          <w:rFonts w:ascii="BRH Devanagari Extra" w:hAnsi="BRH Devanagari Extra" w:cs="BRH Devanagari Extra"/>
+          <w:b/>
+          <w:bCs/>
+          <w:color w:val="000000"/>
+          <w:sz w:val="40"/>
+          <w:szCs w:val="40"/>
+        </w:rPr>
+        <w:t xml:space="preserve"> </w:t>
+      </w:r>
+      <w:r>
+        <w:rPr>
+          <w:rFonts w:ascii="BRH Tamil Tab Extra" w:hAnsi="BRH Tamil Tab Extra" w:cs="BRH Devanagari Extra"/>
+          <w:b/>
+          <w:bCs/>
+          <w:color w:val="000000"/>
+          <w:sz w:val="40"/>
+          <w:szCs w:val="40"/>
+        </w:rPr>
+        <w:t xml:space="preserve"> </w:t>
+      </w:r>
+      <w:r>
+        <w:rPr>
+          <w:rFonts w:ascii="BRH Tamil Tab Extra" w:hAnsi="BRH Tamil Tab Extra" w:cs="BRH Devanagari Extra"/>
+          <w:b/>
+          <w:bCs/>
+          <w:color w:val="000000"/>
+          <w:sz w:val="40"/>
+          <w:szCs w:val="40"/>
+        </w:rPr>
+        <w:t xml:space="preserve"> </w:t>
+      </w:r>
+      <w:r>
+        <w:rPr>
+          <w:rFonts w:ascii="BRH Tamil Tab Extra" w:hAnsi="BRH Tamil Tab Extra" w:cs="BRH Tamil Tab Extra"/>
+          <w:b/>
+          <w:bCs/>
+          <w:color w:val="000000"/>
+          <w:sz w:val="32"/>
+          <w:szCs w:val="32"/>
+        </w:rPr>
+        <w:t xml:space="preserve"> </w:t>
+      </w:r>
+      <w:r>
+        <w:rPr>
+          <w:rFonts w:ascii="BRH Tamil Tab Extra" w:hAnsi="BRH Tamil Tab Extra" w:cs="BRH Tamil Tab Extra"/>
+          <w:b/>
+          <w:bCs/>
+          <w:color w:val="000000"/>
+          <w:sz w:val="40"/>
+          <w:szCs w:val="40"/>
+        </w:rPr>
+        <w:t xml:space="preserve"> ‡</w:t>
+      </w:r>
+      <w:r>
+        <w:rPr>
+          <w:rFonts w:ascii="BRH Tamil Tab Extra" w:hAnsi="BRH Tamil Tab Extra" w:cs="BRH Tamil Tab Extra"/>
+          <w:b/>
+          <w:bCs/>
+          <w:color w:val="000000"/>
+          <w:sz w:val="32"/>
+          <w:szCs w:val="32"/>
+        </w:rPr>
+        <w:t xml:space="preserve"> </w:t>
+      </w:r>
+      <w:r>
+        <w:rPr>
+          <w:rFonts w:ascii="BRH Tamil Tab Extra" w:hAnsi="BRH Tamil Tab Extra" w:cs="BRH Devanagari Extra"/>
+          <w:b/>
+          <w:bCs/>
+          <w:color w:val="000000"/>
+          <w:sz w:val="40"/>
+          <w:szCs w:val="40"/>
+        </w:rPr>
+        <w:t xml:space="preserve">   †     </w:t>
+      </w:r>
+      <w:r>
+        <w:rPr>
+          <w:rFonts w:ascii="BRH Tamil Tab Extra" w:hAnsi="BRH Tamil Tab Extra" w:cs="BRH Devanagari Extra"/>
+          <w:b/>
+          <w:bCs/>
+          <w:sz w:val="40"/>
+          <w:szCs w:val="40"/>
+        </w:rPr>
+        <w:t>…</w:t>
       </w:r>
     </w:p>
     <w:p>
@@ -790,140 +998,6 @@
           <w:szCs w:val="19"/>
         </w:rPr>
       </w:pPr>
-      <w:r>
-        <w:rPr>
-          <w:rFonts w:ascii="BRH Devanagari Extra" w:hAnsi="BRH Devanagari Extra" w:cs="BRH Devanagari Extra"/>
-          <w:color w:val="000000"/>
-          <w:sz w:val="40"/>
-          <w:szCs w:val="40"/>
-        </w:rPr>
-        <w:t xml:space="preserve">ñè  ñ ò </w:t>
-      </w:r>
-      <w:r>
-        <w:rPr>
-          <w:rFonts w:ascii="BRH Devanagari Extra" w:hAnsi="BRH Devanagari Extra" w:cs="BRH Devanagari Extra"/>
-          <w:color w:val="000000"/>
-          <w:sz w:val="40"/>
-          <w:szCs w:val="40"/>
-        </w:rPr>
-        <w:t>óè</w:t>
-      </w:r>
-      <w:r>
-        <w:rPr>
-          <w:rFonts w:ascii="BRH Devanagari Extra" w:hAnsi="BRH Devanagari Extra" w:cs="BRH Devanagari Extra"/>
-          <w:color w:val="000000"/>
-          <w:sz w:val="40"/>
-          <w:szCs w:val="40"/>
-        </w:rPr>
-        <w:t xml:space="preserve"> </w:t>
-      </w:r>
-      <w:r>
-        <w:rPr>
-          <w:rFonts w:ascii="BRH Devanagari Extra" w:hAnsi="BRH Devanagari Extra" w:cs="BRH Devanagari Extra"/>
-          <w:color w:val="000000"/>
-          <w:sz w:val="40"/>
-          <w:szCs w:val="40"/>
-        </w:rPr>
-        <w:t>ó</w:t>
-      </w:r>
-      <w:r>
-        <w:rPr>
-          <w:rFonts w:ascii="BRH Devanagari Extra" w:hAnsi="BRH Devanagari Extra" w:cs="BRH Devanagari Extra"/>
-          <w:color w:val="000000"/>
-          <w:sz w:val="40"/>
-          <w:szCs w:val="40"/>
-        </w:rPr>
-        <w:t xml:space="preserve"> Å  ÅÅ  Æ</w:t>
-      </w:r>
-      <w:r>
-        <w:rPr>
-          <w:rFonts w:ascii="BRH Devanagari Extra" w:hAnsi="BRH Devanagari Extra" w:cs="BRH Devanagari Extra"/>
-          <w:color w:val="000000"/>
-          <w:sz w:val="40"/>
-          <w:szCs w:val="40"/>
-        </w:rPr>
-        <w:t xml:space="preserve"> </w:t>
-      </w:r>
-      <w:r>
-        <w:rPr>
-          <w:rFonts w:ascii="BRH Tamil Tab Extra" w:hAnsi="BRH Tamil Tab Extra" w:cs="BRH Devanagari Extra"/>
-          <w:color w:val="000000"/>
-          <w:sz w:val="40"/>
-          <w:szCs w:val="40"/>
-        </w:rPr>
-        <w:t xml:space="preserve"> </w:t>
-      </w:r>
-      <w:r>
-        <w:rPr>
-          <w:rFonts w:ascii="BRH Tamil Tab Extra" w:hAnsi="BRH Tamil Tab Extra" w:cs="BRH Devanagari Extra"/>
-          <w:color w:val="000000"/>
-          <w:sz w:val="40"/>
-          <w:szCs w:val="40"/>
-        </w:rPr>
-        <w:t xml:space="preserve"> </w:t>
-      </w:r>
-      <w:r>
-        <w:rPr>
-          <w:rFonts w:ascii="BRH Tamil Tab Extra" w:hAnsi="BRH Tamil Tab Extra" w:cs="BRH Tamil Tab Extra"/>
-          <w:color w:val="000000"/>
-          <w:sz w:val="32"/>
-          <w:szCs w:val="32"/>
-        </w:rPr>
-        <w:t xml:space="preserve"> </w:t>
-      </w:r>
-      <w:r>
-        <w:rPr>
-          <w:rFonts w:ascii="BRH Tamil Tab Extra" w:hAnsi="BRH Tamil Tab Extra" w:cs="BRH Tamil Tab Extra"/>
-          <w:color w:val="000000"/>
-          <w:sz w:val="40"/>
-          <w:szCs w:val="40"/>
-        </w:rPr>
-        <w:t xml:space="preserve"> ‡</w:t>
-      </w:r>
-      <w:r>
-        <w:rPr>
-          <w:rFonts w:ascii="BRH Tamil Tab Extra" w:hAnsi="BRH Tamil Tab Extra" w:cs="BRH Tamil Tab Extra"/>
-          <w:color w:val="000000"/>
-          <w:sz w:val="32"/>
-          <w:szCs w:val="32"/>
-        </w:rPr>
-        <w:t xml:space="preserve"> </w:t>
-      </w:r>
-      <w:r>
-        <w:rPr>
-          <w:rFonts w:ascii="BRH Tamil Tab Extra" w:hAnsi="BRH Tamil Tab Extra" w:cs="BRH Devanagari Extra"/>
-          <w:color w:val="000000"/>
-          <w:sz w:val="40"/>
-          <w:szCs w:val="40"/>
-        </w:rPr>
-        <w:t xml:space="preserve"> </w:t>
-      </w:r>
-      <w:r>
-        <w:rPr>
-          <w:rFonts w:ascii="BRH Tamil Tab Extra" w:hAnsi="BRH Tamil Tab Extra" w:cs="BRH Devanagari Extra"/>
-          <w:color w:val="000000"/>
-          <w:sz w:val="40"/>
-          <w:szCs w:val="40"/>
-        </w:rPr>
-        <w:t xml:space="preserve">  </w:t>
-      </w:r>
-      <w:r>
-        <w:rPr>
-          <w:rFonts w:ascii="BRH Tamil Tab Extra" w:hAnsi="BRH Tamil Tab Extra" w:cs="BRH Devanagari Extra"/>
-          <w:color w:val="000000"/>
-          <w:sz w:val="40"/>
-          <w:szCs w:val="40"/>
-        </w:rPr>
-        <w:t xml:space="preserve">†     </w:t>
-      </w:r>
-      <w:r>
-        <w:rPr>
-          <w:rFonts w:ascii="BRH Tamil Tab Extra" w:hAnsi="BRH Tamil Tab Extra" w:cs="BRH Devanagari Extra"/>
-          <w:sz w:val="40"/>
-          <w:szCs w:val="40"/>
-        </w:rPr>
-        <w:t>…</w:t>
-      </w:r>
     </w:p>
     <w:sectPr>
       <w:pgSz w:w="12240" w:h="15840"/>
@@ -936,7 +1010,7 @@
 </file>
 
 <file path=word/styles.xml><?xml version="1.0" encoding="utf-8"?>
-<w:styles xmlns:mc="http://schemas.openxmlformats.org/markup-compatibility/2006" xmlns:r="http://schemas.openxmlformats.org/officeDocument/2006/relationships" xmlns:w="http://schemas.openxmlformats.org/wordprocessingml/2006/main" xmlns:w14="http://schemas.microsoft.com/office/word/2010/wordml" xmlns:w15="http://schemas.microsoft.com/office/word/2012/wordml" xmlns:w16cex="http://schemas.microsoft.com/office/word/2018/wordml/cex" xmlns:w16cid="http://schemas.microsoft.com/office/word/2016/wordml/cid" xmlns:w16="http://schemas.microsoft.com/office/word/2018/wordml" xmlns:w16se="http://schemas.microsoft.com/office/word/2015/wordml/symex" mc:Ignorable="w14 w15 w16se w16cid w16 w16cex">
+<w:styles xmlns:mc="http://schemas.openxmlformats.org/markup-compatibility/2006" xmlns:r="http://schemas.openxmlformats.org/officeDocument/2006/relationships" xmlns:w="http://schemas.openxmlformats.org/wordprocessingml/2006/main" xmlns:w14="http://schemas.microsoft.com/office/word/2010/wordml" xmlns:w15="http://schemas.microsoft.com/office/word/2012/wordml" xmlns:w16cex="http://schemas.microsoft.com/office/word/2018/wordml/cex" xmlns:w16cid="http://schemas.microsoft.com/office/word/2016/wordml/cid" xmlns:w16="http://schemas.microsoft.com/office/word/2018/wordml" xmlns:w16du="http://schemas.microsoft.com/office/word/2023/wordml/word16du" xmlns:w16sdtdh="http://schemas.microsoft.com/office/word/2020/wordml/sdtdatahash" xmlns:w16sdtfl="http://schemas.microsoft.com/office/word/2024/wordml/sdtformatlock" xmlns:w16se="http://schemas.microsoft.com/office/word/2015/wordml/symex" mc:Ignorable="w14 w15 w16se w16cid w16 w16cex w16sdtdh w16sdtfl w16du">
   <w:docDefaults>
     <w:rPrDefault>
       <w:rPr>
@@ -1338,6 +1412,7 @@
   <w:style w:type="character" w:default="1" w:styleId="DefaultParagraphFont">
     <w:name w:val="Default Paragraph Font"/>
     <w:uiPriority w:val="1"/>
+    <w:semiHidden/>
     <w:unhideWhenUsed/>
   </w:style>
   <w:style w:type="table" w:default="1" w:styleId="TableNormal">
@@ -1345,7 +1420,6 @@
     <w:uiPriority w:val="99"/>
     <w:semiHidden/>
     <w:unhideWhenUsed/>
-    <w:qFormat/>
     <w:tblPr>
       <w:tblInd w:w="0" w:type="dxa"/>
       <w:tblCellMar>

</xml_diff>